<commit_message>
Update: Analysis of Hypothesis 4 - DONE
</commit_message>
<xml_diff>
--- a/reports/final_report/hypothesis_02_report.docx
+++ b/reports/final_report/hypothesis_02_report.docx
@@ -52,12 +52,12 @@
     </w:p>
     <w:p>
       <w:r>
-        <w:t>Reaction time was analyzed among valid correct-response trials only. Because reaction-time values were positively skewed, they were log-transformed before modeling. A linear mixed-effects model was fitted with emotional condition as a fixed effect and a participant-specific random intercept. Maximum-likelihood estimation was used. The reaction-time analysis included 9,533 observations.</w:t>
+        <w:t>Reaction time was analyzed among valid correct-response trials only. Because reaction-time values were positively skewed, reaction time was log-transformed before modeling. A linear mixed-effects model was fitted with emotional condition as a fixed effect and a participant-specific random intercept. Maximum-likelihood estimation was used. The reaction-time analysis included 9,533 observations.</w:t>
       </w:r>
     </w:p>
     <w:p>
       <w:r>
-        <w:t>The GEE coefficient was exponentiated and interpreted as an odds ratio. The log reaction-time coefficient was exponentiated and converted to the percentage difference in reaction time between the negative and neutral conditions. A secondary analysis examined inverse efficiency as a descriptive indicator of the joint speed-accuracy pattern. Statistical significance was evaluated using a two-sided alpha level of .05, and 95% confidence intervals are reported.</w:t>
+        <w:t>Model coefficients from the binomial GEE were exponentiated and interpreted as odds ratios. Coefficients from the log reaction-time model were exponentiated and converted to percentage changes relative to the neutral condition. Inverse efficiency was additionally examined as a secondary indicator of the combined speed-accuracy pattern. Statistical significance was evaluated using a two-sided alpha level of .05, and 95% confidence intervals are reported.</w:t>
       </w:r>
     </w:p>
     <w:p>
@@ -83,12 +83,12 @@
     </w:p>
     <w:p>
       <w:r>
-        <w:t>Negative emotion was associated with a small reduction in the estimated odds of a correct response relative to the neutral condition (beta = -0.081, SE = 0.065, z = -1.25, p = 0.210). The corresponding odds ratio was 0.92 (95% CI [0.81, 1.05]).</w:t>
+        <w:t>Relative to the neutral condition, negative emotion was associated with a small reduction in the estimated odds of a correct response (beta = -0.081, SE = 0.065, z = -1.25, p = .210). The corresponding odds ratio was 0.922 (95% CI [0.81, 1.05]).</w:t>
       </w:r>
     </w:p>
     <w:p>
       <w:r>
-        <w:t>The confidence interval included the null value of 1.00, and the comparison was not statistically significant. Therefore, the analysis did not provide sufficient evidence that negative emotion reduced response accuracy relative to the neutral condition.</w:t>
+        <w:t>The confidence interval included the null value of 1.00, and the comparison was not statistically significant. Therefore, the analysis did not provide sufficient evidence that negative emotional induction reduced response accuracy relative to the neutral condition.</w:t>
       </w:r>
     </w:p>
     <w:p>
@@ -116,9 +116,13 @@
         <w:tc>
           <w:tcPr>
             <w:tcW w:type="dxa" w:w="1378"/>
+            <w:vAlign w:val="center"/>
           </w:tcPr>
           <w:p>
             <w:r>
+              <w:rPr>
+                <w:b/>
+              </w:rPr>
               <w:t>Condition</w:t>
             </w:r>
           </w:p>
@@ -126,9 +130,13 @@
         <w:tc>
           <w:tcPr>
             <w:tcW w:type="dxa" w:w="1378"/>
+            <w:vAlign w:val="center"/>
           </w:tcPr>
           <w:p>
             <w:r>
+              <w:rPr>
+                <w:b/>
+              </w:rPr>
               <w:t>Participants</w:t>
             </w:r>
           </w:p>
@@ -136,9 +144,13 @@
         <w:tc>
           <w:tcPr>
             <w:tcW w:type="dxa" w:w="1378"/>
+            <w:vAlign w:val="center"/>
           </w:tcPr>
           <w:p>
             <w:r>
+              <w:rPr>
+                <w:b/>
+              </w:rPr>
               <w:t>Trials</w:t>
             </w:r>
           </w:p>
@@ -146,9 +158,13 @@
         <w:tc>
           <w:tcPr>
             <w:tcW w:type="dxa" w:w="1378"/>
+            <w:vAlign w:val="center"/>
           </w:tcPr>
           <w:p>
             <w:r>
+              <w:rPr>
+                <w:b/>
+              </w:rPr>
               <w:t>Correct</w:t>
             </w:r>
           </w:p>
@@ -156,9 +172,13 @@
         <w:tc>
           <w:tcPr>
             <w:tcW w:type="dxa" w:w="1378"/>
+            <w:vAlign w:val="center"/>
           </w:tcPr>
           <w:p>
             <w:r>
+              <w:rPr>
+                <w:b/>
+              </w:rPr>
               <w:t>Accuracy</w:t>
             </w:r>
           </w:p>
@@ -166,9 +186,13 @@
         <w:tc>
           <w:tcPr>
             <w:tcW w:type="dxa" w:w="1378"/>
+            <w:vAlign w:val="center"/>
           </w:tcPr>
           <w:p>
             <w:r>
+              <w:rPr>
+                <w:b/>
+              </w:rPr>
               <w:t>SD</w:t>
             </w:r>
           </w:p>
@@ -176,9 +200,13 @@
         <w:tc>
           <w:tcPr>
             <w:tcW w:type="dxa" w:w="1378"/>
+            <w:vAlign w:val="center"/>
           </w:tcPr>
           <w:p>
             <w:r>
+              <w:rPr>
+                <w:b/>
+              </w:rPr>
               <w:t>Median</w:t>
             </w:r>
           </w:p>
@@ -188,6 +216,7 @@
         <w:tc>
           <w:tcPr>
             <w:tcW w:type="dxa" w:w="1378"/>
+            <w:vAlign w:val="center"/>
           </w:tcPr>
           <w:p>
             <w:r>
@@ -198,6 +227,7 @@
         <w:tc>
           <w:tcPr>
             <w:tcW w:type="dxa" w:w="1378"/>
+            <w:vAlign w:val="center"/>
           </w:tcPr>
           <w:p>
             <w:r>
@@ -208,6 +238,7 @@
         <w:tc>
           <w:tcPr>
             <w:tcW w:type="dxa" w:w="1378"/>
+            <w:vAlign w:val="center"/>
           </w:tcPr>
           <w:p>
             <w:r>
@@ -218,6 +249,7 @@
         <w:tc>
           <w:tcPr>
             <w:tcW w:type="dxa" w:w="1378"/>
+            <w:vAlign w:val="center"/>
           </w:tcPr>
           <w:p>
             <w:r>
@@ -228,6 +260,7 @@
         <w:tc>
           <w:tcPr>
             <w:tcW w:type="dxa" w:w="1378"/>
+            <w:vAlign w:val="center"/>
           </w:tcPr>
           <w:p>
             <w:r>
@@ -238,6 +271,7 @@
         <w:tc>
           <w:tcPr>
             <w:tcW w:type="dxa" w:w="1378"/>
+            <w:vAlign w:val="center"/>
           </w:tcPr>
           <w:p>
             <w:r>
@@ -248,6 +282,7 @@
         <w:tc>
           <w:tcPr>
             <w:tcW w:type="dxa" w:w="1378"/>
+            <w:vAlign w:val="center"/>
           </w:tcPr>
           <w:p>
             <w:r>
@@ -260,6 +295,7 @@
         <w:tc>
           <w:tcPr>
             <w:tcW w:type="dxa" w:w="1378"/>
+            <w:vAlign w:val="center"/>
           </w:tcPr>
           <w:p>
             <w:r>
@@ -270,6 +306,7 @@
         <w:tc>
           <w:tcPr>
             <w:tcW w:type="dxa" w:w="1378"/>
+            <w:vAlign w:val="center"/>
           </w:tcPr>
           <w:p>
             <w:r>
@@ -280,6 +317,7 @@
         <w:tc>
           <w:tcPr>
             <w:tcW w:type="dxa" w:w="1378"/>
+            <w:vAlign w:val="center"/>
           </w:tcPr>
           <w:p>
             <w:r>
@@ -290,6 +328,7 @@
         <w:tc>
           <w:tcPr>
             <w:tcW w:type="dxa" w:w="1378"/>
+            <w:vAlign w:val="center"/>
           </w:tcPr>
           <w:p>
             <w:r>
@@ -300,6 +339,7 @@
         <w:tc>
           <w:tcPr>
             <w:tcW w:type="dxa" w:w="1378"/>
+            <w:vAlign w:val="center"/>
           </w:tcPr>
           <w:p>
             <w:r>
@@ -310,6 +350,7 @@
         <w:tc>
           <w:tcPr>
             <w:tcW w:type="dxa" w:w="1378"/>
+            <w:vAlign w:val="center"/>
           </w:tcPr>
           <w:p>
             <w:r>
@@ -320,6 +361,7 @@
         <w:tc>
           <w:tcPr>
             <w:tcW w:type="dxa" w:w="1378"/>
+            <w:vAlign w:val="center"/>
           </w:tcPr>
           <w:p>
             <w:r>
@@ -353,9 +395,13 @@
         <w:tc>
           <w:tcPr>
             <w:tcW w:type="dxa" w:w="1930"/>
+            <w:vAlign w:val="center"/>
           </w:tcPr>
           <w:p>
             <w:r>
+              <w:rPr>
+                <w:b/>
+              </w:rPr>
               <w:t>Contrast</w:t>
             </w:r>
           </w:p>
@@ -363,9 +409,13 @@
         <w:tc>
           <w:tcPr>
             <w:tcW w:type="dxa" w:w="1930"/>
+            <w:vAlign w:val="center"/>
           </w:tcPr>
           <w:p>
             <w:r>
+              <w:rPr>
+                <w:b/>
+              </w:rPr>
               <w:t>Beta</w:t>
             </w:r>
           </w:p>
@@ -373,9 +423,13 @@
         <w:tc>
           <w:tcPr>
             <w:tcW w:type="dxa" w:w="1930"/>
+            <w:vAlign w:val="center"/>
           </w:tcPr>
           <w:p>
             <w:r>
+              <w:rPr>
+                <w:b/>
+              </w:rPr>
               <w:t>OR</w:t>
             </w:r>
           </w:p>
@@ -383,9 +437,13 @@
         <w:tc>
           <w:tcPr>
             <w:tcW w:type="dxa" w:w="1930"/>
+            <w:vAlign w:val="center"/>
           </w:tcPr>
           <w:p>
             <w:r>
+              <w:rPr>
+                <w:b/>
+              </w:rPr>
               <w:t>95% CI</w:t>
             </w:r>
           </w:p>
@@ -393,9 +451,13 @@
         <w:tc>
           <w:tcPr>
             <w:tcW w:type="dxa" w:w="1930"/>
+            <w:vAlign w:val="center"/>
           </w:tcPr>
           <w:p>
             <w:r>
+              <w:rPr>
+                <w:b/>
+              </w:rPr>
               <w:t>p</w:t>
             </w:r>
           </w:p>
@@ -405,6 +467,7 @@
         <w:tc>
           <w:tcPr>
             <w:tcW w:type="dxa" w:w="1930"/>
+            <w:vAlign w:val="center"/>
           </w:tcPr>
           <w:p>
             <w:r>
@@ -415,6 +478,7 @@
         <w:tc>
           <w:tcPr>
             <w:tcW w:type="dxa" w:w="1930"/>
+            <w:vAlign w:val="center"/>
           </w:tcPr>
           <w:p>
             <w:r>
@@ -425,16 +489,18 @@
         <w:tc>
           <w:tcPr>
             <w:tcW w:type="dxa" w:w="1930"/>
+            <w:vAlign w:val="center"/>
           </w:tcPr>
           <w:p>
             <w:r>
-              <w:t>0.92</w:t>
+              <w:t>0.922</w:t>
             </w:r>
           </w:p>
         </w:tc>
         <w:tc>
           <w:tcPr>
             <w:tcW w:type="dxa" w:w="1930"/>
+            <w:vAlign w:val="center"/>
           </w:tcPr>
           <w:p>
             <w:r>
@@ -445,15 +511,17 @@
         <w:tc>
           <w:tcPr>
             <w:tcW w:type="dxa" w:w="1930"/>
+            <w:vAlign w:val="center"/>
           </w:tcPr>
           <w:p>
             <w:r>
-              <w:t>= 0.210</w:t>
+              <w:t>= .210</w:t>
             </w:r>
           </w:p>
         </w:tc>
       </w:tr>
     </w:tbl>
+    <w:p/>
     <w:p>
       <w:pPr>
         <w:pStyle w:val="Heading2"/>
@@ -464,17 +532,17 @@
     </w:p>
     <w:p>
       <w:r>
-        <w:t>The mean reaction time was 740.2 ms in the negative condition and 966.6 ms in the neutral condition.</w:t>
+        <w:t>Mean reaction time was 740.2 ms in the negative condition and 966.6 ms in the neutral condition.</w:t>
       </w:r>
     </w:p>
     <w:p>
       <w:r>
-        <w:t>The negative condition was significantly associated with lower log reaction time relative to the neutral condition (beta = -0.268, SE = 0.015, z = -17.37, p &lt; .001).</w:t>
+        <w:t>The negative emotional condition was significantly associated with lower log reaction time relative to the neutral condition (beta = -0.268, SE = 0.015, z = -17.37, p &lt; .001).</w:t>
       </w:r>
     </w:p>
     <w:p>
       <w:r>
-        <w:t>After back-transformation, reaction time under negative emotion was estimated to be 23.5% lower than under the neutral condition (95% CI from -25.8% to -21.1%). Thus, participants responded significantly faster, rather than more slowly, during the negative emotional condition.</w:t>
+        <w:t>After back-transformation, reaction time under negative emotion was estimated to be 23.5% lower than under the neutral condition (95% CI [-25.8%, -21.1%]). Thus, participants responded significantly faster, rather than more slowly, during the negative emotional condition.</w:t>
       </w:r>
     </w:p>
     <w:p>
@@ -502,9 +570,13 @@
         <w:tc>
           <w:tcPr>
             <w:tcW w:type="dxa" w:w="1378"/>
+            <w:vAlign w:val="center"/>
           </w:tcPr>
           <w:p>
             <w:r>
+              <w:rPr>
+                <w:b/>
+              </w:rPr>
               <w:t>Condition</w:t>
             </w:r>
           </w:p>
@@ -512,9 +584,13 @@
         <w:tc>
           <w:tcPr>
             <w:tcW w:type="dxa" w:w="1378"/>
+            <w:vAlign w:val="center"/>
           </w:tcPr>
           <w:p>
             <w:r>
+              <w:rPr>
+                <w:b/>
+              </w:rPr>
               <w:t>Participants</w:t>
             </w:r>
           </w:p>
@@ -522,9 +598,13 @@
         <w:tc>
           <w:tcPr>
             <w:tcW w:type="dxa" w:w="1378"/>
+            <w:vAlign w:val="center"/>
           </w:tcPr>
           <w:p>
             <w:r>
+              <w:rPr>
+                <w:b/>
+              </w:rPr>
               <w:t>Trials</w:t>
             </w:r>
           </w:p>
@@ -532,9 +612,13 @@
         <w:tc>
           <w:tcPr>
             <w:tcW w:type="dxa" w:w="1378"/>
+            <w:vAlign w:val="center"/>
           </w:tcPr>
           <w:p>
             <w:r>
+              <w:rPr>
+                <w:b/>
+              </w:rPr>
               <w:t>Mean RT</w:t>
             </w:r>
           </w:p>
@@ -542,9 +626,13 @@
         <w:tc>
           <w:tcPr>
             <w:tcW w:type="dxa" w:w="1378"/>
+            <w:vAlign w:val="center"/>
           </w:tcPr>
           <w:p>
             <w:r>
+              <w:rPr>
+                <w:b/>
+              </w:rPr>
               <w:t>SD</w:t>
             </w:r>
           </w:p>
@@ -552,9 +640,13 @@
         <w:tc>
           <w:tcPr>
             <w:tcW w:type="dxa" w:w="1378"/>
+            <w:vAlign w:val="center"/>
           </w:tcPr>
           <w:p>
             <w:r>
+              <w:rPr>
+                <w:b/>
+              </w:rPr>
               <w:t>Median RT</w:t>
             </w:r>
           </w:p>
@@ -562,9 +654,13 @@
         <w:tc>
           <w:tcPr>
             <w:tcW w:type="dxa" w:w="1378"/>
+            <w:vAlign w:val="center"/>
           </w:tcPr>
           <w:p>
             <w:r>
+              <w:rPr>
+                <w:b/>
+              </w:rPr>
               <w:t>Mean log RT</w:t>
             </w:r>
           </w:p>
@@ -574,6 +670,7 @@
         <w:tc>
           <w:tcPr>
             <w:tcW w:type="dxa" w:w="1378"/>
+            <w:vAlign w:val="center"/>
           </w:tcPr>
           <w:p>
             <w:r>
@@ -584,6 +681,7 @@
         <w:tc>
           <w:tcPr>
             <w:tcW w:type="dxa" w:w="1378"/>
+            <w:vAlign w:val="center"/>
           </w:tcPr>
           <w:p>
             <w:r>
@@ -594,6 +692,7 @@
         <w:tc>
           <w:tcPr>
             <w:tcW w:type="dxa" w:w="1378"/>
+            <w:vAlign w:val="center"/>
           </w:tcPr>
           <w:p>
             <w:r>
@@ -604,6 +703,7 @@
         <w:tc>
           <w:tcPr>
             <w:tcW w:type="dxa" w:w="1378"/>
+            <w:vAlign w:val="center"/>
           </w:tcPr>
           <w:p>
             <w:r>
@@ -614,6 +714,7 @@
         <w:tc>
           <w:tcPr>
             <w:tcW w:type="dxa" w:w="1378"/>
+            <w:vAlign w:val="center"/>
           </w:tcPr>
           <w:p>
             <w:r>
@@ -624,6 +725,7 @@
         <w:tc>
           <w:tcPr>
             <w:tcW w:type="dxa" w:w="1378"/>
+            <w:vAlign w:val="center"/>
           </w:tcPr>
           <w:p>
             <w:r>
@@ -634,6 +736,7 @@
         <w:tc>
           <w:tcPr>
             <w:tcW w:type="dxa" w:w="1378"/>
+            <w:vAlign w:val="center"/>
           </w:tcPr>
           <w:p>
             <w:r>
@@ -646,6 +749,7 @@
         <w:tc>
           <w:tcPr>
             <w:tcW w:type="dxa" w:w="1378"/>
+            <w:vAlign w:val="center"/>
           </w:tcPr>
           <w:p>
             <w:r>
@@ -656,6 +760,7 @@
         <w:tc>
           <w:tcPr>
             <w:tcW w:type="dxa" w:w="1378"/>
+            <w:vAlign w:val="center"/>
           </w:tcPr>
           <w:p>
             <w:r>
@@ -666,6 +771,7 @@
         <w:tc>
           <w:tcPr>
             <w:tcW w:type="dxa" w:w="1378"/>
+            <w:vAlign w:val="center"/>
           </w:tcPr>
           <w:p>
             <w:r>
@@ -676,6 +782,7 @@
         <w:tc>
           <w:tcPr>
             <w:tcW w:type="dxa" w:w="1378"/>
+            <w:vAlign w:val="center"/>
           </w:tcPr>
           <w:p>
             <w:r>
@@ -686,6 +793,7 @@
         <w:tc>
           <w:tcPr>
             <w:tcW w:type="dxa" w:w="1378"/>
+            <w:vAlign w:val="center"/>
           </w:tcPr>
           <w:p>
             <w:r>
@@ -696,6 +804,7 @@
         <w:tc>
           <w:tcPr>
             <w:tcW w:type="dxa" w:w="1378"/>
+            <w:vAlign w:val="center"/>
           </w:tcPr>
           <w:p>
             <w:r>
@@ -706,6 +815,7 @@
         <w:tc>
           <w:tcPr>
             <w:tcW w:type="dxa" w:w="1378"/>
+            <w:vAlign w:val="center"/>
           </w:tcPr>
           <w:p>
             <w:r>
@@ -739,9 +849,13 @@
         <w:tc>
           <w:tcPr>
             <w:tcW w:type="dxa" w:w="1930"/>
+            <w:vAlign w:val="center"/>
           </w:tcPr>
           <w:p>
             <w:r>
+              <w:rPr>
+                <w:b/>
+              </w:rPr>
               <w:t>Contrast</w:t>
             </w:r>
           </w:p>
@@ -749,9 +863,13 @@
         <w:tc>
           <w:tcPr>
             <w:tcW w:type="dxa" w:w="1930"/>
+            <w:vAlign w:val="center"/>
           </w:tcPr>
           <w:p>
             <w:r>
+              <w:rPr>
+                <w:b/>
+              </w:rPr>
               <w:t>Beta</w:t>
             </w:r>
           </w:p>
@@ -759,9 +877,13 @@
         <w:tc>
           <w:tcPr>
             <w:tcW w:type="dxa" w:w="1930"/>
+            <w:vAlign w:val="center"/>
           </w:tcPr>
           <w:p>
             <w:r>
+              <w:rPr>
+                <w:b/>
+              </w:rPr>
               <w:t>RT change</w:t>
             </w:r>
           </w:p>
@@ -769,9 +891,13 @@
         <w:tc>
           <w:tcPr>
             <w:tcW w:type="dxa" w:w="1930"/>
+            <w:vAlign w:val="center"/>
           </w:tcPr>
           <w:p>
             <w:r>
+              <w:rPr>
+                <w:b/>
+              </w:rPr>
               <w:t>95% CI</w:t>
             </w:r>
           </w:p>
@@ -779,9 +905,13 @@
         <w:tc>
           <w:tcPr>
             <w:tcW w:type="dxa" w:w="1930"/>
+            <w:vAlign w:val="center"/>
           </w:tcPr>
           <w:p>
             <w:r>
+              <w:rPr>
+                <w:b/>
+              </w:rPr>
               <w:t>p</w:t>
             </w:r>
           </w:p>
@@ -791,6 +921,7 @@
         <w:tc>
           <w:tcPr>
             <w:tcW w:type="dxa" w:w="1930"/>
+            <w:vAlign w:val="center"/>
           </w:tcPr>
           <w:p>
             <w:r>
@@ -801,6 +932,7 @@
         <w:tc>
           <w:tcPr>
             <w:tcW w:type="dxa" w:w="1930"/>
+            <w:vAlign w:val="center"/>
           </w:tcPr>
           <w:p>
             <w:r>
@@ -811,6 +943,7 @@
         <w:tc>
           <w:tcPr>
             <w:tcW w:type="dxa" w:w="1930"/>
+            <w:vAlign w:val="center"/>
           </w:tcPr>
           <w:p>
             <w:r>
@@ -821,6 +954,7 @@
         <w:tc>
           <w:tcPr>
             <w:tcW w:type="dxa" w:w="1930"/>
+            <w:vAlign w:val="center"/>
           </w:tcPr>
           <w:p>
             <w:r>
@@ -831,6 +965,7 @@
         <w:tc>
           <w:tcPr>
             <w:tcW w:type="dxa" w:w="1930"/>
+            <w:vAlign w:val="center"/>
           </w:tcPr>
           <w:p>
             <w:r>
@@ -840,19 +975,227 @@
         </w:tc>
       </w:tr>
     </w:tbl>
+    <w:p/>
     <w:p>
       <w:pPr>
         <w:pStyle w:val="Heading2"/>
       </w:pPr>
       <w:r>
-        <w:t>Speed-Accuracy Pattern</w:t>
+        <w:t>Processing Efficiency</w:t>
       </w:r>
     </w:p>
     <w:p>
       <w:r>
-        <w:t>Negative emotion was associated with significantly faster responses, whereas the corresponding reduction in accuracy was small and statistically non-significant. This pattern does not provide sufficient statistical evidence of a speed-accuracy trade-off, although it may indicate a descriptive shift toward faster responding.</w:t>
+        <w:t>Inverse efficiency was examined as a secondary measure combining reaction speed and response accuracy. Mean IES was 875.11 under negative emotion and 1170.40 under the neutral condition.</w:t>
       </w:r>
     </w:p>
+    <w:p>
+      <w:r>
+        <w:t>The paired comparison yielded a mean difference of -295.29, t = -4.74, p &lt; .001. Negative emotion was associated with significantly better combined processing efficiency.</w:t>
+      </w:r>
+    </w:p>
+    <w:p>
+      <w:r>
+        <w:t>Table 5. Paired inverse-efficiency comparison.</w:t>
+      </w:r>
+    </w:p>
+    <w:tbl>
+      <w:tblPr>
+        <w:tblStyle w:val="TableGrid"/>
+        <w:tblW w:type="auto" w:w="0"/>
+        <w:jc w:val="center"/>
+        <w:tblLook w:firstColumn="1" w:firstRow="1" w:lastColumn="0" w:lastRow="0" w:noHBand="0" w:noVBand="1" w:val="04A0"/>
+      </w:tblPr>
+      <w:tblGrid>
+        <w:gridCol w:w="1378"/>
+        <w:gridCol w:w="1378"/>
+        <w:gridCol w:w="1378"/>
+        <w:gridCol w:w="1378"/>
+        <w:gridCol w:w="1378"/>
+        <w:gridCol w:w="1378"/>
+        <w:gridCol w:w="1378"/>
+      </w:tblGrid>
+      <w:tr>
+        <w:tc>
+          <w:tcPr>
+            <w:tcW w:type="dxa" w:w="1378"/>
+            <w:vAlign w:val="center"/>
+          </w:tcPr>
+          <w:p>
+            <w:r>
+              <w:rPr>
+                <w:b/>
+              </w:rPr>
+              <w:t>Comparison</w:t>
+            </w:r>
+          </w:p>
+        </w:tc>
+        <w:tc>
+          <w:tcPr>
+            <w:tcW w:type="dxa" w:w="1378"/>
+            <w:vAlign w:val="center"/>
+          </w:tcPr>
+          <w:p>
+            <w:r>
+              <w:rPr>
+                <w:b/>
+              </w:rPr>
+              <w:t>N</w:t>
+            </w:r>
+          </w:p>
+        </w:tc>
+        <w:tc>
+          <w:tcPr>
+            <w:tcW w:type="dxa" w:w="1378"/>
+            <w:vAlign w:val="center"/>
+          </w:tcPr>
+          <w:p>
+            <w:r>
+              <w:rPr>
+                <w:b/>
+              </w:rPr>
+              <w:t>Neutral IES</w:t>
+            </w:r>
+          </w:p>
+        </w:tc>
+        <w:tc>
+          <w:tcPr>
+            <w:tcW w:type="dxa" w:w="1378"/>
+            <w:vAlign w:val="center"/>
+          </w:tcPr>
+          <w:p>
+            <w:r>
+              <w:rPr>
+                <w:b/>
+              </w:rPr>
+              <w:t>Negative IES</w:t>
+            </w:r>
+          </w:p>
+        </w:tc>
+        <w:tc>
+          <w:tcPr>
+            <w:tcW w:type="dxa" w:w="1378"/>
+            <w:vAlign w:val="center"/>
+          </w:tcPr>
+          <w:p>
+            <w:r>
+              <w:rPr>
+                <w:b/>
+              </w:rPr>
+              <w:t>Difference</w:t>
+            </w:r>
+          </w:p>
+        </w:tc>
+        <w:tc>
+          <w:tcPr>
+            <w:tcW w:type="dxa" w:w="1378"/>
+            <w:vAlign w:val="center"/>
+          </w:tcPr>
+          <w:p>
+            <w:r>
+              <w:rPr>
+                <w:b/>
+              </w:rPr>
+              <w:t>t</w:t>
+            </w:r>
+          </w:p>
+        </w:tc>
+        <w:tc>
+          <w:tcPr>
+            <w:tcW w:type="dxa" w:w="1378"/>
+            <w:vAlign w:val="center"/>
+          </w:tcPr>
+          <w:p>
+            <w:r>
+              <w:rPr>
+                <w:b/>
+              </w:rPr>
+              <w:t>p</w:t>
+            </w:r>
+          </w:p>
+        </w:tc>
+      </w:tr>
+      <w:tr>
+        <w:tc>
+          <w:tcPr>
+            <w:tcW w:type="dxa" w:w="1378"/>
+            <w:vAlign w:val="center"/>
+          </w:tcPr>
+          <w:p>
+            <w:r>
+              <w:t>Negative vs Neutral</w:t>
+            </w:r>
+          </w:p>
+        </w:tc>
+        <w:tc>
+          <w:tcPr>
+            <w:tcW w:type="dxa" w:w="1378"/>
+            <w:vAlign w:val="center"/>
+          </w:tcPr>
+          <w:p>
+            <w:r>
+              <w:t>22</w:t>
+            </w:r>
+          </w:p>
+        </w:tc>
+        <w:tc>
+          <w:tcPr>
+            <w:tcW w:type="dxa" w:w="1378"/>
+            <w:vAlign w:val="center"/>
+          </w:tcPr>
+          <w:p>
+            <w:r>
+              <w:t>1170.40</w:t>
+            </w:r>
+          </w:p>
+        </w:tc>
+        <w:tc>
+          <w:tcPr>
+            <w:tcW w:type="dxa" w:w="1378"/>
+            <w:vAlign w:val="center"/>
+          </w:tcPr>
+          <w:p>
+            <w:r>
+              <w:t>875.11</w:t>
+            </w:r>
+          </w:p>
+        </w:tc>
+        <w:tc>
+          <w:tcPr>
+            <w:tcW w:type="dxa" w:w="1378"/>
+            <w:vAlign w:val="center"/>
+          </w:tcPr>
+          <w:p>
+            <w:r>
+              <w:t>-295.29</w:t>
+            </w:r>
+          </w:p>
+        </w:tc>
+        <w:tc>
+          <w:tcPr>
+            <w:tcW w:type="dxa" w:w="1378"/>
+            <w:vAlign w:val="center"/>
+          </w:tcPr>
+          <w:p>
+            <w:r>
+              <w:t>-4.74</w:t>
+            </w:r>
+          </w:p>
+        </w:tc>
+        <w:tc>
+          <w:tcPr>
+            <w:tcW w:type="dxa" w:w="1378"/>
+            <w:vAlign w:val="center"/>
+          </w:tcPr>
+          <w:p>
+            <w:r>
+              <w:t>&lt; .001</w:t>
+            </w:r>
+          </w:p>
+        </w:tc>
+      </w:tr>
+    </w:tbl>
+    <w:p/>
     <w:p>
       <w:pPr>
         <w:pStyle w:val="Heading1"/>
@@ -866,7 +1209,7 @@
         <w:pStyle w:val="ListBullet"/>
       </w:pPr>
       <w:r>
-        <w:t>Hypothesis 2 is supported if negative emotion is associated with significantly lower accuracy, significantly slower reaction time, or both.</w:t>
+        <w:t>H2 is supported if negative emotion is associated with significantly lower accuracy, significantly slower reaction time, or both.</w:t>
       </w:r>
     </w:p>
     <w:p>
@@ -874,7 +1217,7 @@
         <w:pStyle w:val="ListBullet"/>
       </w:pPr>
       <w:r>
-        <w:t>Hypothesis 2 is partially supported if only one impairment outcome is statistically supported or if there is clear evidence of a speed-accuracy trade-off.</w:t>
+        <w:t>H2 is partially supported if only one impairment outcome is statistically supported or if there is clear evidence of a speed-accuracy trade-off.</w:t>
       </w:r>
     </w:p>
     <w:p>
@@ -882,7 +1225,7 @@
         <w:pStyle w:val="ListBullet"/>
       </w:pPr>
       <w:r>
-        <w:t>Hypothesis 2 is not supported if negative emotion does not significantly reduce accuracy and responses are not significantly slower than under neutral emotion.</w:t>
+        <w:t>H2 is not supported if negative emotion does not significantly reduce accuracy and responses are not significantly slower than under neutral emotion.</w:t>
       </w:r>
     </w:p>
     <w:p>
@@ -895,12 +1238,17 @@
     </w:p>
     <w:p>
       <w:r>
-        <w:t>Hypothesis 2 was not supported. The hypothesis predicted that negative emotional induction would impair working-memory performance relative to the neutral condition.</w:t>
+        <w:t>Hypothesis 2 was not supported.</w:t>
       </w:r>
     </w:p>
     <w:p>
       <w:r>
-        <w:t>Although accuracy was descriptively lower under negative emotion, the difference was small and statistically non-significant. Consequently, there was no reliable evidence that negative emotion decreased the probability of producing a correct response.</w:t>
+        <w:t>The hypothesis predicted that negative emotional induction would impair working-memory performance relative to the neutral condition.</w:t>
+      </w:r>
+    </w:p>
+    <w:p>
+      <w:r>
+        <w:t>Although response accuracy was descriptively lower under negative emotion, the difference was small and statistically non-significant. Therefore, there was no reliable evidence that negative emotion decreased the probability of producing a correct response.</w:t>
       </w:r>
     </w:p>
     <w:p>
@@ -910,12 +1258,12 @@
     </w:p>
     <w:p>
       <w:r>
-        <w:t>The combination of significantly faster responses and a small, non-significant reduction in accuracy may be descriptively compatible with a shift toward faster responding. However, it does not provide strong evidence of a speed-accuracy trade-off, because the reduction in accuracy was not statistically supported.</w:t>
+        <w:t>The combination of significantly faster responses and a small, non-significant reduction in accuracy may be descriptively compatible with a shift toward faster responding. However, it does not provide strong evidence of a speed-accuracy trade-off because the reduction in accuracy was not statistically supported.</w:t>
       </w:r>
     </w:p>
     <w:p>
       <w:r>
-        <w:t>Overall, negative emotional induction altered response speed but did not produce the expected deterioration in working-memory performance. These findings indicate that the negative condition was associated with faster responding without a statistically detectable loss of accuracy.</w:t>
+        <w:t>Overall, negative emotional induction altered response speed but did not produce the expected deterioration in working-memory performance.</w:t>
       </w:r>
     </w:p>
     <w:p>
@@ -928,13 +1276,7 @@
     </w:p>
     <w:p>
       <w:r>
-        <w:rPr>
-          <w:b/>
-        </w:rPr>
-        <w:t xml:space="preserve">Conclusion: </w:t>
-      </w:r>
-      <w:r>
-        <w:t>Hypothesis 2 was not supported. Negative emotion did not significantly reduce accuracy and was associated with faster, rather than slower, reaction times relative to the neutral condition.</w:t>
+        <w:t>Conclusion: Hypothesis 2 was not supported. Negative emotion did not significantly reduce response accuracy and was associated with faster, rather than slower, reaction times relative to the neutral condition.</w:t>
       </w:r>
     </w:p>
     <w:sectPr>
@@ -1422,10 +1764,11 @@
       <w:outlineLvl w:val="2"/>
     </w:pPr>
     <w:rPr>
-      <w:rFonts w:asciiTheme="majorHAnsi" w:eastAsiaTheme="majorEastAsia" w:hAnsiTheme="majorHAnsi" w:cstheme="majorBidi"/>
+      <w:rFonts w:asciiTheme="majorHAnsi" w:eastAsiaTheme="majorEastAsia" w:hAnsiTheme="majorHAnsi" w:cstheme="majorBidi" w:ascii="Arial" w:hAnsi="Arial"/>
       <w:b/>
       <w:bCs/>
       <w:color w:val="4F81BD" w:themeColor="accent1"/>
+      <w:sz w:val="22"/>
     </w:rPr>
   </w:style>
   <w:style w:type="paragraph" w:styleId="Heading4">

</xml_diff>